<commit_message>
nâng cấp 2020→2022: 4 .docx (CĐ15-18) + 10 RTF (CĐ1-10), sửa emission values từ BTR1
</commit_message>
<xml_diff>
--- a/CĐ15_7.1 Cai thien kiem ke linh vuc năng lượng.docx
+++ b/CĐ15_7.1 Cai thien kiem ke linh vuc năng lượng.docx
@@ -5854,7 +5854,7 @@
         <w:rPr>
           <w:rtl w:val="0"/>
         </w:rPr>
-        <w:t xml:space="preserve">Ước tính tổng lượng phát thải khí nhà kính trong bốn lĩnh vực năng lượng, nông nghiệp, LULUCF và chất thải vào năm 2020 là 466 triệu tấn CO2 tương đương và vào năm 2030 tăng lên 760,5 triệu tấn CO2 tương đương. Lĩnh vực năng lượng vẫn là nguồn phát thải KNK lớn nhất theo ước tính.</w:t>
+        <w:t>Ước tính tổng lượng phát thải khí nhà kính trong bốn lĩnh vực năng lượng, nông nghiệp, LULUCF và chất thải vào năm 2022 là 466 triệu tấn CO2 tương đương và vào năm 2030 tăng lên 760,5 triệu tấn CO2 tương đương. Lĩnh vực năng lượng vẫn là nguồn phát thải KNK lớn nhất theo ước tính.</w:t>
       </w:r>
     </w:p>
     <w:p>
@@ -6234,7 +6234,7 @@
                 <w:szCs w:val="26"/>
                 <w:rtl w:val="0"/>
               </w:rPr>
-              <w:t xml:space="preserve">100,8</w:t>
+              <w:t>82,5</w:t>
             </w:r>
           </w:p>
         </w:tc>
@@ -6340,7 +6340,7 @@
                 <w:szCs w:val="26"/>
                 <w:rtl w:val="0"/>
               </w:rPr>
-              <w:t xml:space="preserve">-42,5</w:t>
+              <w:t>--48,1</w:t>
             </w:r>
           </w:p>
         </w:tc>
@@ -6446,7 +6446,7 @@
                 <w:szCs w:val="26"/>
                 <w:rtl w:val="0"/>
               </w:rPr>
-              <w:t xml:space="preserve">26,6</w:t>
+              <w:t>37,4</w:t>
             </w:r>
           </w:p>
         </w:tc>
@@ -6556,7 +6556,7 @@
                 <w:szCs w:val="26"/>
                 <w:rtl w:val="0"/>
               </w:rPr>
-              <w:t xml:space="preserve">466,0</w:t>
+              <w:t>426,7</w:t>
             </w:r>
           </w:p>
         </w:tc>

</xml_diff>